<commit_message>
docs(pz14): record verified PostgreSQL run
</commit_message>
<xml_diff>
--- a/reports/word/pz14.docx
+++ b/reports/word/pz14.docx
@@ -24,26 +24,40 @@
         <w:rPr>
           <w:b/>
         </w:rPr>
-        <w:t>Подготовка реализации завершена; реальная проверка PostgreSQL и замеры ещё не выполнены. Практику нельзя считать полностью завершённой.</w:t>
+        <w:t>Практика выполнена и проверена на локальном PostgreSQL.</w:t>
       </w:r>
       <w:r>
-        <w:t xml:space="preserve"> Локальный сервер PostgreSQL принимает подключения на 127.0.0.1:5432, но запрос без пароля вернул </w:t>
+        <w:t xml:space="preserve"> 13 октября 2026 года пользователь запустил </w:t>
       </w:r>
       <w:r>
         <w:rPr>
           <w:rFonts w:ascii="Consolas" w:hAnsi="Consolas"/>
           <w:sz w:val="18"/>
         </w:rPr>
-        <w:t>fe_sendauth: no password supplied</w:t>
+        <w:t>run-local.ps1</w:t>
       </w:r>
       <w:r>
-        <w:t>. Пароль отсутствует в доступном окружении; его нужно ввести локально скрытым вводом через подготовленный скрипт. Пароль в чат или файл присылать не требуется.</w:t>
+        <w:t xml:space="preserve">, ввёл пароль скрытым вводом и получил </w:t>
       </w:r>
-    </w:p>
-    <w:p>
-      <w:pPr/>
       <w:r>
-        <w:t>Цель — перенести Notes API в PostgreSQL, сравнить индексы и keyset с большим OFFSET, батч с N+1, измерить влияние пула. Создан отдельный модуль practices/pz14-notes-db; №11 и №12 не изменялись. Данный отчёт описывает фактически проверенную подготовку и ещё не подтверждённые SQL-сценарии. Значения производительности и планы не выдумывались.</w:t>
+        <w:rPr>
+          <w:rFonts w:ascii="Consolas" w:hAnsi="Consolas"/>
+          <w:sz w:val="18"/>
+        </w:rPr>
+        <w:t>PZ14 scenario passed.</w:t>
+      </w:r>
+      <w:r>
+        <w:t xml:space="preserve">. В этом отчёте приведены данные именно этого прогона: </w:t>
+      </w:r>
+      <w:r>
+        <w:rPr>
+          <w:rFonts w:ascii="Consolas" w:hAnsi="Consolas"/>
+          <w:sz w:val="18"/>
+        </w:rPr>
+        <w:t>run_id=94cdcd550e994030bb953856ca1b1079</w:t>
+      </w:r>
+      <w:r>
+        <w:t>. Цель — перенести Notes API в PostgreSQL, сравнить индексы и keyset с большим OFFSET, батч с N+1 и влияние размера пула. Создан отдельный модуль practices/pz14-notes-db; №11 и №12 не изменялись.</w:t>
       </w:r>
     </w:p>
     <w:p>
@@ -59,7 +73,29 @@
         <w:keepNext/>
       </w:pPr>
       <w:r>
-        <w:t>Фактически доступны Go go1.27.2 windows/amd64 и клиент psql PostgreSQL 18.6. Версия самого PostgreSQL-сервера SQL-запросом пока не подтверждена. Зависимости закреплены: chi v5.4.0, pgx/v5 v5.7.2. Используется database/sql с драйвером pgx/stdlib. PostgreSQL и Docker глобально не перенастраивались.</w:t>
+        <w:t xml:space="preserve">Фактически проверены Go go1.27.2 windows/amd64, PostgreSQL-клиент и сервер 18.6, Windows PowerShell 5.1.26100.9549. Зависимости закреплены: chi v5.4.0, pgx/v5 v5.7.2. Используется database/sql с драйвером pgx/stdlib. PostgreSQL и Docker глобально не перенастраивались. </w:t>
+      </w:r>
+      <w:hyperlink r:id="rId9">
+        <w:r>
+          <w:rPr>
+            <w:color w:val="195A85"/>
+          </w:rPr>
+          <w:t>Версии</w:t>
+        </w:r>
+      </w:hyperlink>
+      <w:r>
+        <w:t xml:space="preserve"> и </w:t>
+      </w:r>
+      <w:hyperlink r:id="rId10">
+        <w:r>
+          <w:rPr>
+            <w:color w:val="195A85"/>
+          </w:rPr>
+          <w:t>подготовка данных</w:t>
+        </w:r>
+      </w:hyperlink>
+      <w:r>
+        <w:t xml:space="preserve"> сохранены.</w:t>
       </w:r>
     </w:p>
     <w:p>
@@ -146,7 +182,18 @@
     <w:p>
       <w:pPr/>
       <w:r>
-        <w:t>Модель Note сохраняет id/title/content/createdAt/updatedAt. Все пять CRUD-маршрутов реализованы на chi. Добавлены batch, many и диагностический stats. Контексты HTTP ограничены 10 секундами. JSON, параметры и схема проверяются; клиент получает общий текст ошибки без строк подключения. Эти операции пока проверены на уровне сборки и валидации, а не на реальной БД.</w:t>
+        <w:t xml:space="preserve">Модель Note сохраняет id/title/content/createdAt/updatedAt. Все пять CRUD-маршрутов реализованы на chi. Добавлены batch, many и диагностический stats. Контексты HTTP ограничены 10 секундами. JSON, параметры и схема проверяются; клиент получает общий текст ошибки без строк подключения. </w:t>
+      </w:r>
+      <w:hyperlink r:id="rId11">
+        <w:r>
+          <w:rPr>
+            <w:color w:val="195A85"/>
+          </w:rPr>
+          <w:t>Реальный HTTP-лог</w:t>
+        </w:r>
+      </w:hyperlink>
+      <w:r>
+        <w:t xml:space="preserve"> подтверждает POST 201, GET 200, PATCH 200, DELETE 204 с пустым телом, GET после удаления 404 и ошибки 400.</w:t>
       </w:r>
     </w:p>
     <w:p>
@@ -160,7 +207,7 @@
     <w:p>
       <w:pPr/>
       <w:r>
-        <w:t>Каждый запуск создаёт две новые схемы в учебной БД pz14_notes: pz14_&lt;UUID&gt;_base и pz14_&lt;UUID&gt;_opt. В каждой запланированы 100000 одинаковых детерминированных строк. В baseline только первичный ключ; optimized получает индексы сортировки и полнотекстового поиска. Старые схемы не удаляются и не изменяются. Повторный запуск не использует ранее проиндексированную таблицу как baseline. Никаких DROP/TRUNCATE в коде нет; новые схемы остаются для последующей инспекции и требуют места.</w:t>
+        <w:t>Каждый запуск создаёт две новые схемы в учебной БД pz14_notes: pz14_&lt;UUID&gt;_base и pz14_&lt;UUID&gt;_opt. В проверенном прогоне каждая содержала 100000 одинаковых детерминированных строк. В baseline только первичный ключ; optimized получает индексы сортировки и полнотекстового поиска. Старые схемы не удаляются и не изменяются. Повторный запуск не использует ранее проиндексированную таблицу как baseline. Никаких DROP/TRUNCATE в коде нет; новые схемы остаются для последующей инспекции и требуют места.</w:t>
       </w:r>
     </w:p>
     <w:p>
@@ -194,7 +241,7 @@
         <w:pStyle w:val="Heading1"/>
       </w:pPr>
       <w:r>
-        <w:t>SQL и ещё не полученные планы</w:t>
+        <w:t>SQL и реальные планы</w:t>
       </w:r>
     </w:p>
     <w:p>
@@ -351,19 +398,423 @@
         <w:t>WHERE id=ANY($1::bigint[])</w:t>
       </w:r>
       <w:r>
-        <w:t>; array_position возвращает строки в порядке входных ID. Скрипт должен сравнить результаты обоих вариантов и 300 последовательных строк keyset без пропусков/дубликатов.</w:t>
+        <w:t xml:space="preserve">; array_position возвращает строки в порядке входных ID. </w:t>
+      </w:r>
+      <w:hyperlink r:id="rId12">
+        <w:r>
+          <w:rPr>
+            <w:color w:val="195A85"/>
+          </w:rPr>
+          <w:t>Проверки данных</w:t>
+        </w:r>
+      </w:hyperlink>
+      <w:r>
+        <w:t xml:space="preserve"> подтвердили одинаковые 50 строк OFFSET/keyset на глубине 80000, одинаковые 20 строк N+1/batch и 300 последовательных строк keyset без пропусков и дубликатов.</w:t>
       </w:r>
     </w:p>
     <w:p>
       <w:pPr/>
       <w:r>
+        <w:t xml:space="preserve">Сняты настоящие </w:t>
+      </w:r>
+      <w:hyperlink r:id="rId13">
+        <w:r>
+          <w:rPr>
+            <w:color w:val="195A85"/>
+          </w:rPr>
+          <w:t>планы до нагрузки</w:t>
+        </w:r>
+      </w:hyperlink>
+      <w:r>
+        <w:t xml:space="preserve"> и </w:t>
+      </w:r>
+      <w:hyperlink r:id="rId14">
+        <w:r>
+          <w:rPr>
+            <w:color w:val="195A85"/>
+          </w:rPr>
+          <w:t>после нагрузки</w:t>
+        </w:r>
+      </w:hyperlink>
+      <w:r>
+        <w:t>. На одинаковых 100000 строках:</w:t>
+      </w:r>
+    </w:p>
+    <w:tbl>
+      <w:tblPr>
+        <w:tblStyle w:val="TableGrid"/>
+        <w:tblW w:type="auto" w:w="0"/>
+        <w:jc w:val="center"/>
+        <w:tblLayout w:type="autofit"/>
+        <w:tblLook w:firstColumn="1" w:firstRow="1" w:lastColumn="0" w:lastRow="0" w:noHBand="0" w:noVBand="1" w:val="04A0"/>
+      </w:tblPr>
+      <w:tblGrid>
+        <w:gridCol w:w="3289"/>
+        <w:gridCol w:w="3289"/>
+        <w:gridCol w:w="3289"/>
+      </w:tblGrid>
+      <w:tr>
+        <w:trPr>
+          <w:tblHeader/>
+        </w:trPr>
+        <w:tc>
+          <w:tcPr>
+            <w:tcW w:type="dxa" w:w="3289"/>
+            <w:shd w:fill="E9EDF0"/>
+          </w:tcPr>
+          <w:p>
+            <w:pPr>
+              <w:spacing w:after="0"/>
+            </w:pPr>
+            <w:r>
+              <w:rPr>
+                <w:b/>
+                <w:sz w:val="18"/>
+              </w:rPr>
+              <w:t>Запрос</w:t>
+            </w:r>
+          </w:p>
+        </w:tc>
+        <w:tc>
+          <w:tcPr>
+            <w:tcW w:type="dxa" w:w="3289"/>
+            <w:shd w:fill="E9EDF0"/>
+          </w:tcPr>
+          <w:p>
+            <w:pPr>
+              <w:spacing w:after="0"/>
+            </w:pPr>
+            <w:r>
+              <w:rPr>
+                <w:b/>
+                <w:sz w:val="18"/>
+              </w:rPr>
+              <w:t>Baseline</w:t>
+            </w:r>
+          </w:p>
+        </w:tc>
+        <w:tc>
+          <w:tcPr>
+            <w:tcW w:type="dxa" w:w="3289"/>
+            <w:shd w:fill="E9EDF0"/>
+          </w:tcPr>
+          <w:p>
+            <w:pPr>
+              <w:spacing w:after="0"/>
+            </w:pPr>
+            <w:r>
+              <w:rPr>
+                <w:b/>
+                <w:sz w:val="18"/>
+              </w:rPr>
+              <w:t>Optimized</w:t>
+            </w:r>
+          </w:p>
+        </w:tc>
+      </w:tr>
+      <w:tr>
+        <w:tc>
+          <w:tcPr>
+            <w:tcW w:type="dxa" w:w="3289"/>
+          </w:tcPr>
+          <w:p>
+            <w:pPr>
+              <w:spacing w:after="0"/>
+            </w:pPr>
+            <w:r>
+              <w:rPr>
+                <w:sz w:val="18"/>
+              </w:rPr>
+              <w:t>Глубокая страница, 50 строк</w:t>
+            </w:r>
+          </w:p>
+        </w:tc>
+        <w:tc>
+          <w:tcPr>
+            <w:tcW w:type="dxa" w:w="3289"/>
+          </w:tcPr>
+          <w:p>
+            <w:pPr>
+              <w:spacing w:after="0"/>
+            </w:pPr>
+            <w:r>
+              <w:rPr>
+                <w:rFonts w:ascii="Consolas" w:hAnsi="Consolas"/>
+                <w:sz w:val="18"/>
+              </w:rPr>
+              <w:t>Seq Scan</w:t>
+            </w:r>
+            <w:r>
+              <w:rPr>
+                <w:sz w:val="18"/>
+              </w:rPr>
+              <w:t xml:space="preserve"> + внешняя сортировка 19800 kB; Execution Time </w:t>
+            </w:r>
+            <w:r>
+              <w:rPr>
+                <w:b/>
+                <w:sz w:val="18"/>
+              </w:rPr>
+              <w:t>71,067 мс</w:t>
+            </w:r>
+            <w:r>
+              <w:rPr>
+                <w:sz w:val="18"/>
+              </w:rPr>
+              <w:t>, temp read 2071/written 2482</w:t>
+            </w:r>
+          </w:p>
+        </w:tc>
+        <w:tc>
+          <w:tcPr>
+            <w:tcW w:type="dxa" w:w="3289"/>
+          </w:tcPr>
+          <w:p>
+            <w:pPr>
+              <w:spacing w:after="0"/>
+            </w:pPr>
+            <w:r>
+              <w:rPr>
+                <w:rFonts w:ascii="Consolas" w:hAnsi="Consolas"/>
+                <w:sz w:val="18"/>
+              </w:rPr>
+              <w:t>Index Scan using notes_created_id</w:t>
+            </w:r>
+            <w:r>
+              <w:rPr>
+                <w:sz w:val="18"/>
+              </w:rPr>
+              <w:t xml:space="preserve">, 50 строк; </w:t>
+            </w:r>
+            <w:r>
+              <w:rPr>
+                <w:b/>
+                <w:sz w:val="18"/>
+              </w:rPr>
+              <w:t>0,073 мс</w:t>
+            </w:r>
+            <w:r>
+              <w:rPr>
+                <w:sz w:val="18"/>
+              </w:rPr>
+              <w:t>, shared hit 2/read 3</w:t>
+            </w:r>
+          </w:p>
+        </w:tc>
+      </w:tr>
+      <w:tr>
+        <w:tc>
+          <w:tcPr>
+            <w:tcW w:type="dxa" w:w="3289"/>
+          </w:tcPr>
+          <w:p>
+            <w:pPr>
+              <w:spacing w:after="0"/>
+            </w:pPr>
+            <w:r>
+              <w:rPr>
+                <w:sz w:val="18"/>
+              </w:rPr>
+              <w:t xml:space="preserve">Полнотекстовый поиск </w:t>
+            </w:r>
+            <w:r>
+              <w:rPr>
+                <w:rFonts w:ascii="Consolas" w:hAnsi="Consolas"/>
+                <w:sz w:val="18"/>
+              </w:rPr>
+              <w:t>redis</w:t>
+            </w:r>
+            <w:r>
+              <w:rPr>
+                <w:sz w:val="18"/>
+              </w:rPr>
+              <w:t>, 100 строк</w:t>
+            </w:r>
+          </w:p>
+        </w:tc>
+        <w:tc>
+          <w:tcPr>
+            <w:tcW w:type="dxa" w:w="3289"/>
+          </w:tcPr>
+          <w:p>
+            <w:pPr>
+              <w:spacing w:after="0"/>
+            </w:pPr>
+            <w:r>
+              <w:rPr>
+                <w:rFonts w:ascii="Consolas" w:hAnsi="Consolas"/>
+                <w:sz w:val="18"/>
+              </w:rPr>
+              <w:t>Parallel Seq Scan</w:t>
+            </w:r>
+            <w:r>
+              <w:rPr>
+                <w:sz w:val="18"/>
+              </w:rPr>
+              <w:t xml:space="preserve">, </w:t>
+            </w:r>
+            <w:r>
+              <w:rPr>
+                <w:b/>
+                <w:sz w:val="18"/>
+              </w:rPr>
+              <w:t>51,667 мс</w:t>
+            </w:r>
+          </w:p>
+        </w:tc>
+        <w:tc>
+          <w:tcPr>
+            <w:tcW w:type="dxa" w:w="3289"/>
+          </w:tcPr>
+          <w:p>
+            <w:pPr>
+              <w:spacing w:after="0"/>
+            </w:pPr>
+            <w:r>
+              <w:rPr>
+                <w:rFonts w:ascii="Consolas" w:hAnsi="Consolas"/>
+                <w:sz w:val="18"/>
+              </w:rPr>
+              <w:t>Bitmap Index Scan using notes_title_fts</w:t>
+            </w:r>
+            <w:r>
+              <w:rPr>
+                <w:sz w:val="18"/>
+              </w:rPr>
+              <w:t xml:space="preserve"> + </w:t>
+            </w:r>
+            <w:r>
+              <w:rPr>
+                <w:rFonts w:ascii="Consolas" w:hAnsi="Consolas"/>
+                <w:sz w:val="18"/>
+              </w:rPr>
+              <w:t>Bitmap Heap Scan</w:t>
+            </w:r>
+            <w:r>
+              <w:rPr>
+                <w:sz w:val="18"/>
+              </w:rPr>
+              <w:t xml:space="preserve">, </w:t>
+            </w:r>
+            <w:r>
+              <w:rPr>
+                <w:b/>
+                <w:sz w:val="18"/>
+              </w:rPr>
+              <w:t>0,769 мс</w:t>
+            </w:r>
+          </w:p>
+        </w:tc>
+      </w:tr>
+      <w:tr>
+        <w:tc>
+          <w:tcPr>
+            <w:tcW w:type="dxa" w:w="3289"/>
+          </w:tcPr>
+          <w:p>
+            <w:pPr>
+              <w:spacing w:after="0"/>
+            </w:pPr>
+            <w:r>
+              <w:rPr>
+                <w:sz w:val="18"/>
+              </w:rPr>
+              <w:t>Поиск 20 ID</w:t>
+            </w:r>
+          </w:p>
+        </w:tc>
+        <w:tc>
+          <w:tcPr>
+            <w:tcW w:type="dxa" w:w="3289"/>
+          </w:tcPr>
+          <w:p>
+            <w:pPr>
+              <w:spacing w:after="0"/>
+            </w:pPr>
+            <w:r>
+              <w:rPr>
+                <w:sz w:val="18"/>
+              </w:rPr>
+              <w:t xml:space="preserve">20 отдельных запросов в API; один типовой </w:t>
+            </w:r>
+            <w:r>
+              <w:rPr>
+                <w:rFonts w:ascii="Consolas" w:hAnsi="Consolas"/>
+                <w:sz w:val="18"/>
+              </w:rPr>
+              <w:t>Index Scan</w:t>
+            </w:r>
+            <w:r>
+              <w:rPr>
+                <w:sz w:val="18"/>
+              </w:rPr>
+              <w:t xml:space="preserve"> по PK показал </w:t>
+            </w:r>
+            <w:r>
+              <w:rPr>
+                <w:b/>
+                <w:sz w:val="18"/>
+              </w:rPr>
+              <w:t>0,153 мс</w:t>
+            </w:r>
+          </w:p>
+        </w:tc>
+        <w:tc>
+          <w:tcPr>
+            <w:tcW w:type="dxa" w:w="3289"/>
+          </w:tcPr>
+          <w:p>
+            <w:pPr>
+              <w:spacing w:after="0"/>
+            </w:pPr>
+            <w:r>
+              <w:rPr>
+                <w:sz w:val="18"/>
+              </w:rPr>
+              <w:t xml:space="preserve">один </w:t>
+            </w:r>
+            <w:r>
+              <w:rPr>
+                <w:rFonts w:ascii="Consolas" w:hAnsi="Consolas"/>
+                <w:sz w:val="18"/>
+              </w:rPr>
+              <w:t>id=ANY($1::bigint[])</w:t>
+            </w:r>
+            <w:r>
+              <w:rPr>
+                <w:sz w:val="18"/>
+              </w:rPr>
+              <w:t xml:space="preserve"> и сортировка по входному порядку, </w:t>
+            </w:r>
+            <w:r>
+              <w:rPr>
+                <w:b/>
+                <w:sz w:val="18"/>
+              </w:rPr>
+              <w:t>0,094 мс</w:t>
+            </w:r>
+          </w:p>
+        </w:tc>
+      </w:tr>
+    </w:tbl>
+    <w:p>
+      <w:pPr>
+        <w:spacing w:after="0"/>
+      </w:pPr>
+    </w:p>
+    <w:p>
+      <w:pPr/>
+      <w:r>
+        <w:t xml:space="preserve">Последняя строка </w:t>
+      </w:r>
+      <w:r>
         <w:rPr>
           <w:b/>
         </w:rPr>
-        <w:t>EXPLAIN (ANALYZE, BUFFERS) до/после не запускался: нет аутентифицированного подключения.</w:t>
+        <w:t>не</w:t>
       </w:r>
       <w:r>
-        <w:t xml:space="preserve"> Seq Scan/Index Scan, Execution Time и BUFFERS пока не получены. Скрипт снимет планы OFFSET/keyset, полнотекстового поиска и одиночного/батч-запроса перед нагрузкой и после неё.</w:t>
+        <w:t xml:space="preserve"> сравнивает суммарное время 20 запросов с одним SQL-запросом: базовый EXPLAIN показывает только один типовой поиск. Эффект устранения N+1 подтверждается количеством SQL-вызовов и отдельной HTTP-нагрузкой ниже. Повторные планы после нагрузки показали 59,004 мс для OFFSET и 0,046 мс для keyset; кэш и планирование могут влиять на абсолютные времена.</w:t>
       </w:r>
     </w:p>
     <w:p>
@@ -383,22 +834,69 @@
         <w:rPr>
           <w:b/>
         </w:rPr>
-        <w:t>не измеренный выбор оптимального пула</w:t>
+        <w:t>не универсальный выбор оптимального пула</w:t>
       </w:r>
       <w:r>
-        <w:t>. GET /stats выдаёт DBStats; нагрузчик рассчитывает дельты WaitCount/WaitDuration и фиксирует OpenConnections/Idle/InUse.</w:t>
+        <w:t xml:space="preserve">. GET /stats выдаёт DBStats; нагрузчик рассчитывает дельты WaitCount/WaitDuration и фиксирует OpenConnections/Idle/InUse. При pool=1 и concurrency=8 ожидание соединения возникало; при pool=8 во всех сценариях этого прогона </w:t>
+      </w:r>
+      <w:r>
+        <w:rPr>
+          <w:rFonts w:ascii="Consolas" w:hAnsi="Consolas"/>
+          <w:sz w:val="18"/>
+        </w:rPr>
+        <w:t>wait_count_delta=0</w:t>
+      </w:r>
+      <w:r>
+        <w:t>.</w:t>
       </w:r>
     </w:p>
     <w:p>
       <w:pPr/>
       <w:r>
-        <w:t>Подготовлены параметризованные INSERT и SELECT по ID. CreateMany в одной транзакции ReadCommitted сохраняет заметки вместе с audit-записями. Валидация каждого элемента выполняется внутри транзакции, поэтому ошибка второй заметки должна откатить первую вставку. defer Rollback покрывает ошибку; Commit выполняется только после всех вставок. Реальные commit/rollback ещё требуют запуска. Пропуски последовательности ID при rollback нормальны и не считаются оставшейся заметкой.</w:t>
+        <w:t>Подготовлены параметризованные INSERT и SELECT по ID. CreateMany в одной транзакции ReadCommitted сохраняет заметки вместе с audit-записями. Валидация каждого элемента выполняется внутри транзакции, поэтому ошибка второй заметки откатывает первую вставку. defer Rollback покрывает ошибку; Commit выполняется только после всех вставок. Реальный прогон подтвердил rollback: первая вставка отсутствует после ошибки второй. Commit сохранил две заметки и две audit-записи. Пропуски последовательности ID при rollback нормальны и не считаются оставшейся заметкой.</w:t>
       </w:r>
     </w:p>
     <w:p>
       <w:pPr/>
       <w:r>
-        <w:t>pg_stat_statements пока не проверено. Скрипт сначала прочитает shared_preload_libraries. Если preload отсутствует, укажет точную причину и не изменит глобальную конфигурацию. При доступности создаст расширение только в учебной БД и использует актуальные total_exec_time/mean_exec_time. До реального запуска доступность расширения утверждать нельзя.</w:t>
+        <w:rPr>
+          <w:rFonts w:ascii="Consolas" w:hAnsi="Consolas"/>
+          <w:sz w:val="18"/>
+        </w:rPr>
+        <w:t>pg_stat_statements</w:t>
+      </w:r>
+      <w:r>
+        <w:t xml:space="preserve"> недоступно: его нет в </w:t>
+      </w:r>
+      <w:r>
+        <w:rPr>
+          <w:rFonts w:ascii="Consolas" w:hAnsi="Consolas"/>
+          <w:sz w:val="18"/>
+        </w:rPr>
+        <w:t>shared_preload_libraries</w:t>
+      </w:r>
+      <w:r>
+        <w:t xml:space="preserve">. Глобальную конфигурацию не меняли. В этой работе диагностика основана на EXPLAIN и метриках приложения. При последующем включении расширения на PostgreSQL 18 нужно использовать актуальные </w:t>
+      </w:r>
+      <w:r>
+        <w:rPr>
+          <w:rFonts w:ascii="Consolas" w:hAnsi="Consolas"/>
+          <w:sz w:val="18"/>
+        </w:rPr>
+        <w:t>total_exec_time</w:t>
+      </w:r>
+      <w:r>
+        <w:t>/</w:t>
+      </w:r>
+      <w:r>
+        <w:rPr>
+          <w:rFonts w:ascii="Consolas" w:hAnsi="Consolas"/>
+          <w:sz w:val="18"/>
+        </w:rPr>
+        <w:t>mean_exec_time</w:t>
+      </w:r>
+      <w:r>
+        <w:t>.</w:t>
       </w:r>
     </w:p>
     <w:p>
@@ -406,7 +904,7 @@
         <w:pStyle w:val="Heading1"/>
       </w:pPr>
       <w:r>
-        <w:t>Проверки и запланированная нагрузка</w:t>
+        <w:t>Проверки и измеренная нагрузка</w:t>
       </w:r>
     </w:p>
     <w:p>
@@ -414,7 +912,7 @@
       <w:r>
         <w:t xml:space="preserve">Фактически успешно выполнены go fmt ./..., go vet ./..., go test ./..., go build ./..., go mod verify; последняя команда вывела all modules verified. </w:t>
       </w:r>
-      <w:hyperlink r:id="rId9">
+      <w:hyperlink r:id="rId15">
         <w:r>
           <w:rPr>
             <w:color w:val="195A85"/>
@@ -429,16 +927,51 @@
     <w:p>
       <w:pPr/>
       <w:r>
-        <w:t xml:space="preserve">Реальный запуск API с PostgreSQL, HTTP CRUD, схемы, транзакции, планы и нагрузка </w:t>
+        <w:t xml:space="preserve">Реальный запуск API с PostgreSQL, HTTP CRUD, схемы, транзакции, планы и нагрузка проверены. В каждом из 12 сценариев выполнены 10 последовательных warmup-запросов и 200 измеряемых closed-loop запросов с concurrency=8, без пауз. Список возвращает одинаковые ID на логической глубине 80000; get — ID 1; batch — ID 1..20 в одинаковом порядке. Все 2400 измеряемых запросов завершились без ошибок. Исходные </w:t>
       </w:r>
+      <w:hyperlink r:id="rId16">
+        <w:r>
+          <w:rPr>
+            <w:color w:val="195A85"/>
+          </w:rPr>
+          <w:t>логи pool=1 baseline</w:t>
+        </w:r>
+      </w:hyperlink>
       <w:r>
-        <w:rPr>
-          <w:b/>
-        </w:rPr>
-        <w:t>не проверены</w:t>
+        <w:t xml:space="preserve">, </w:t>
       </w:r>
+      <w:hyperlink r:id="rId17">
+        <w:r>
+          <w:rPr>
+            <w:color w:val="195A85"/>
+          </w:rPr>
+          <w:t>pool=8 baseline</w:t>
+        </w:r>
+      </w:hyperlink>
       <w:r>
-        <w:t>. Загрузка данных не запускалась. Ниже конфигурация подготовленного эксперимента, а не результаты:</w:t>
+        <w:t xml:space="preserve">, </w:t>
+      </w:r>
+      <w:hyperlink r:id="rId18">
+        <w:r>
+          <w:rPr>
+            <w:color w:val="195A85"/>
+          </w:rPr>
+          <w:t>pool=1 optimized</w:t>
+        </w:r>
+      </w:hyperlink>
+      <w:r>
+        <w:t xml:space="preserve"> и </w:t>
+      </w:r>
+      <w:hyperlink r:id="rId19">
+        <w:r>
+          <w:rPr>
+            <w:color w:val="195A85"/>
+          </w:rPr>
+          <w:t>pool=8 optimized</w:t>
+        </w:r>
+      </w:hyperlink>
+      <w:r>
+        <w:t xml:space="preserve"> сохранены.</w:t>
       </w:r>
     </w:p>
     <w:tbl>
@@ -450,11 +983,14 @@
         <w:tblLook w:firstColumn="1" w:firstRow="1" w:lastColumn="0" w:lastRow="0" w:noHBand="0" w:noVBand="1" w:val="04A0"/>
       </w:tblPr>
       <w:tblGrid>
-        <w:gridCol w:w="1973"/>
-        <w:gridCol w:w="1973"/>
-        <w:gridCol w:w="1973"/>
-        <w:gridCol w:w="1973"/>
-        <w:gridCol w:w="1973"/>
+        <w:gridCol w:w="1233"/>
+        <w:gridCol w:w="1233"/>
+        <w:gridCol w:w="1233"/>
+        <w:gridCol w:w="1233"/>
+        <w:gridCol w:w="1233"/>
+        <w:gridCol w:w="1233"/>
+        <w:gridCol w:w="1233"/>
+        <w:gridCol w:w="1233"/>
       </w:tblGrid>
       <w:tr>
         <w:trPr>
@@ -462,7 +998,7 @@
         </w:trPr>
         <w:tc>
           <w:tcPr>
-            <w:tcW w:type="dxa" w:w="1973"/>
+            <w:tcW w:type="dxa" w:w="1233"/>
             <w:shd w:fill="E9EDF0"/>
           </w:tcPr>
           <w:p>
@@ -480,7 +1016,7 @@
         </w:tc>
         <w:tc>
           <w:tcPr>
-            <w:tcW w:type="dxa" w:w="1973"/>
+            <w:tcW w:type="dxa" w:w="1233"/>
             <w:shd w:fill="E9EDF0"/>
           </w:tcPr>
           <w:p>
@@ -492,13 +1028,13 @@
                 <w:b/>
                 <w:sz w:val="18"/>
               </w:rPr>
-              <w:t>MaxOpen/MaxIdle</w:t>
+              <w:t>Пул</w:t>
             </w:r>
           </w:p>
         </w:tc>
         <w:tc>
           <w:tcPr>
-            <w:tcW w:type="dxa" w:w="1973"/>
+            <w:tcW w:type="dxa" w:w="1233"/>
             <w:shd w:fill="E9EDF0"/>
           </w:tcPr>
           <w:p>
@@ -510,13 +1046,13 @@
                 <w:b/>
                 <w:sz w:val="18"/>
               </w:rPr>
-              <w:t>Сценарии</w:t>
+              <w:t>Маршрут</w:t>
             </w:r>
           </w:p>
         </w:tc>
         <w:tc>
           <w:tcPr>
-            <w:tcW w:type="dxa" w:w="1973"/>
+            <w:tcW w:type="dxa" w:w="1233"/>
             <w:shd w:fill="E9EDF0"/>
           </w:tcPr>
           <w:p>
@@ -528,13 +1064,13 @@
                 <w:b/>
                 <w:sz w:val="18"/>
               </w:rPr>
-              <w:t>Число запросов</w:t>
+              <w:t>RPS</w:t>
             </w:r>
           </w:p>
         </w:tc>
         <w:tc>
           <w:tcPr>
-            <w:tcW w:type="dxa" w:w="1973"/>
+            <w:tcW w:type="dxa" w:w="1233"/>
             <w:shd w:fill="E9EDF0"/>
           </w:tcPr>
           <w:p>
@@ -546,7 +1082,61 @@
                 <w:b/>
                 <w:sz w:val="18"/>
               </w:rPr>
-              <w:t>Измеренные метрики</w:t>
+              <w:t>p95, мс</w:t>
+            </w:r>
+          </w:p>
+        </w:tc>
+        <w:tc>
+          <w:tcPr>
+            <w:tcW w:type="dxa" w:w="1233"/>
+            <w:shd w:fill="E9EDF0"/>
+          </w:tcPr>
+          <w:p>
+            <w:pPr>
+              <w:spacing w:after="0"/>
+            </w:pPr>
+            <w:r>
+              <w:rPr>
+                <w:b/>
+                <w:sz w:val="18"/>
+              </w:rPr>
+              <w:t>p99, мс</w:t>
+            </w:r>
+          </w:p>
+        </w:tc>
+        <w:tc>
+          <w:tcPr>
+            <w:tcW w:type="dxa" w:w="1233"/>
+            <w:shd w:fill="E9EDF0"/>
+          </w:tcPr>
+          <w:p>
+            <w:pPr>
+              <w:spacing w:after="0"/>
+            </w:pPr>
+            <w:r>
+              <w:rPr>
+                <w:b/>
+                <w:sz w:val="18"/>
+              </w:rPr>
+              <w:t>Ошибки</w:t>
+            </w:r>
+          </w:p>
+        </w:tc>
+        <w:tc>
+          <w:tcPr>
+            <w:tcW w:type="dxa" w:w="1233"/>
+            <w:shd w:fill="E9EDF0"/>
+          </w:tcPr>
+          <w:p>
+            <w:pPr>
+              <w:spacing w:after="0"/>
+            </w:pPr>
+            <w:r>
+              <w:rPr>
+                <w:b/>
+                <w:sz w:val="18"/>
+              </w:rPr>
+              <w:t>Ожидания пула</w:t>
             </w:r>
           </w:p>
         </w:tc>
@@ -554,7 +1144,7 @@
       <w:tr>
         <w:tc>
           <w:tcPr>
-            <w:tcW w:type="dxa" w:w="1973"/>
+            <w:tcW w:type="dxa" w:w="1233"/>
           </w:tcPr>
           <w:p>
             <w:pPr>
@@ -570,7 +1160,7 @@
         </w:tc>
         <w:tc>
           <w:tcPr>
-            <w:tcW w:type="dxa" w:w="1973"/>
+            <w:tcW w:type="dxa" w:w="1233"/>
           </w:tcPr>
           <w:p>
             <w:pPr>
@@ -580,13 +1170,13 @@
               <w:rPr>
                 <w:sz w:val="18"/>
               </w:rPr>
-              <w:t>1/1</w:t>
+              <w:t>1</w:t>
             </w:r>
           </w:p>
         </w:tc>
         <w:tc>
           <w:tcPr>
-            <w:tcW w:type="dxa" w:w="1973"/>
+            <w:tcW w:type="dxa" w:w="1233"/>
           </w:tcPr>
           <w:p>
             <w:pPr>
@@ -596,13 +1186,13 @@
               <w:rPr>
                 <w:sz w:val="18"/>
               </w:rPr>
-              <w:t>list/get/batch N+1</w:t>
+              <w:t>list OFFSET</w:t>
             </w:r>
           </w:p>
         </w:tc>
         <w:tc>
           <w:tcPr>
-            <w:tcW w:type="dxa" w:w="1973"/>
+            <w:tcW w:type="dxa" w:w="1233"/>
           </w:tcPr>
           <w:p>
             <w:pPr>
@@ -612,13 +1202,13 @@
               <w:rPr>
                 <w:sz w:val="18"/>
               </w:rPr>
-              <w:t>по 200, concurrency 8</w:t>
+              <w:t>12,43</w:t>
             </w:r>
           </w:p>
         </w:tc>
         <w:tc>
           <w:tcPr>
-            <w:tcW w:type="dxa" w:w="1973"/>
+            <w:tcW w:type="dxa" w:w="1233"/>
           </w:tcPr>
           <w:p>
             <w:pPr>
@@ -628,7 +1218,55 @@
               <w:rPr>
                 <w:sz w:val="18"/>
               </w:rPr>
-              <w:t>ещё не получены</w:t>
+              <w:t>1766,13</w:t>
+            </w:r>
+          </w:p>
+        </w:tc>
+        <w:tc>
+          <w:tcPr>
+            <w:tcW w:type="dxa" w:w="1233"/>
+          </w:tcPr>
+          <w:p>
+            <w:pPr>
+              <w:spacing w:after="0"/>
+            </w:pPr>
+            <w:r>
+              <w:rPr>
+                <w:sz w:val="18"/>
+              </w:rPr>
+              <w:t>2353,78</w:t>
+            </w:r>
+          </w:p>
+        </w:tc>
+        <w:tc>
+          <w:tcPr>
+            <w:tcW w:type="dxa" w:w="1233"/>
+          </w:tcPr>
+          <w:p>
+            <w:pPr>
+              <w:spacing w:after="0"/>
+            </w:pPr>
+            <w:r>
+              <w:rPr>
+                <w:sz w:val="18"/>
+              </w:rPr>
+              <w:t>0/200</w:t>
+            </w:r>
+          </w:p>
+        </w:tc>
+        <w:tc>
+          <w:tcPr>
+            <w:tcW w:type="dxa" w:w="1233"/>
+          </w:tcPr>
+          <w:p>
+            <w:pPr>
+              <w:spacing w:after="0"/>
+            </w:pPr>
+            <w:r>
+              <w:rPr>
+                <w:sz w:val="18"/>
+              </w:rPr>
+              <w:t>199</w:t>
             </w:r>
           </w:p>
         </w:tc>
@@ -636,7 +1274,137 @@
       <w:tr>
         <w:tc>
           <w:tcPr>
-            <w:tcW w:type="dxa" w:w="1973"/>
+            <w:tcW w:type="dxa" w:w="1233"/>
+          </w:tcPr>
+          <w:p>
+            <w:pPr>
+              <w:spacing w:after="0"/>
+            </w:pPr>
+            <w:r>
+              <w:rPr>
+                <w:sz w:val="18"/>
+              </w:rPr>
+              <w:t>Optimized</w:t>
+            </w:r>
+          </w:p>
+        </w:tc>
+        <w:tc>
+          <w:tcPr>
+            <w:tcW w:type="dxa" w:w="1233"/>
+          </w:tcPr>
+          <w:p>
+            <w:pPr>
+              <w:spacing w:after="0"/>
+            </w:pPr>
+            <w:r>
+              <w:rPr>
+                <w:sz w:val="18"/>
+              </w:rPr>
+              <w:t>1</w:t>
+            </w:r>
+          </w:p>
+        </w:tc>
+        <w:tc>
+          <w:tcPr>
+            <w:tcW w:type="dxa" w:w="1233"/>
+          </w:tcPr>
+          <w:p>
+            <w:pPr>
+              <w:spacing w:after="0"/>
+            </w:pPr>
+            <w:r>
+              <w:rPr>
+                <w:sz w:val="18"/>
+              </w:rPr>
+              <w:t>list keyset</w:t>
+            </w:r>
+          </w:p>
+        </w:tc>
+        <w:tc>
+          <w:tcPr>
+            <w:tcW w:type="dxa" w:w="1233"/>
+          </w:tcPr>
+          <w:p>
+            <w:pPr>
+              <w:spacing w:after="0"/>
+            </w:pPr>
+            <w:r>
+              <w:rPr>
+                <w:sz w:val="18"/>
+              </w:rPr>
+              <w:t>2898,55</w:t>
+            </w:r>
+          </w:p>
+        </w:tc>
+        <w:tc>
+          <w:tcPr>
+            <w:tcW w:type="dxa" w:w="1233"/>
+          </w:tcPr>
+          <w:p>
+            <w:pPr>
+              <w:spacing w:after="0"/>
+            </w:pPr>
+            <w:r>
+              <w:rPr>
+                <w:sz w:val="18"/>
+              </w:rPr>
+              <w:t>5,50</w:t>
+            </w:r>
+          </w:p>
+        </w:tc>
+        <w:tc>
+          <w:tcPr>
+            <w:tcW w:type="dxa" w:w="1233"/>
+          </w:tcPr>
+          <w:p>
+            <w:pPr>
+              <w:spacing w:after="0"/>
+            </w:pPr>
+            <w:r>
+              <w:rPr>
+                <w:sz w:val="18"/>
+              </w:rPr>
+              <w:t>21,00</w:t>
+            </w:r>
+          </w:p>
+        </w:tc>
+        <w:tc>
+          <w:tcPr>
+            <w:tcW w:type="dxa" w:w="1233"/>
+          </w:tcPr>
+          <w:p>
+            <w:pPr>
+              <w:spacing w:after="0"/>
+            </w:pPr>
+            <w:r>
+              <w:rPr>
+                <w:sz w:val="18"/>
+              </w:rPr>
+              <w:t>0/200</w:t>
+            </w:r>
+          </w:p>
+        </w:tc>
+        <w:tc>
+          <w:tcPr>
+            <w:tcW w:type="dxa" w:w="1233"/>
+          </w:tcPr>
+          <w:p>
+            <w:pPr>
+              <w:spacing w:after="0"/>
+            </w:pPr>
+            <w:r>
+              <w:rPr>
+                <w:sz w:val="18"/>
+              </w:rPr>
+              <w:t>198</w:t>
+            </w:r>
+          </w:p>
+        </w:tc>
+      </w:tr>
+      <w:tr>
+        <w:tc>
+          <w:tcPr>
+            <w:tcW w:type="dxa" w:w="1233"/>
           </w:tcPr>
           <w:p>
             <w:pPr>
@@ -652,7 +1420,7 @@
         </w:tc>
         <w:tc>
           <w:tcPr>
-            <w:tcW w:type="dxa" w:w="1973"/>
+            <w:tcW w:type="dxa" w:w="1233"/>
           </w:tcPr>
           <w:p>
             <w:pPr>
@@ -662,13 +1430,13 @@
               <w:rPr>
                 <w:sz w:val="18"/>
               </w:rPr>
-              <w:t>8/8</w:t>
+              <w:t>8</w:t>
             </w:r>
           </w:p>
         </w:tc>
         <w:tc>
           <w:tcPr>
-            <w:tcW w:type="dxa" w:w="1973"/>
+            <w:tcW w:type="dxa" w:w="1233"/>
           </w:tcPr>
           <w:p>
             <w:pPr>
@@ -678,13 +1446,13 @@
               <w:rPr>
                 <w:sz w:val="18"/>
               </w:rPr>
-              <w:t>те же</w:t>
+              <w:t>list OFFSET</w:t>
             </w:r>
           </w:p>
         </w:tc>
         <w:tc>
           <w:tcPr>
-            <w:tcW w:type="dxa" w:w="1973"/>
+            <w:tcW w:type="dxa" w:w="1233"/>
           </w:tcPr>
           <w:p>
             <w:pPr>
@@ -694,13 +1462,13 @@
               <w:rPr>
                 <w:sz w:val="18"/>
               </w:rPr>
-              <w:t>те же</w:t>
+              <w:t>86,33</w:t>
             </w:r>
           </w:p>
         </w:tc>
         <w:tc>
           <w:tcPr>
-            <w:tcW w:type="dxa" w:w="1973"/>
+            <w:tcW w:type="dxa" w:w="1233"/>
           </w:tcPr>
           <w:p>
             <w:pPr>
@@ -710,7 +1478,55 @@
               <w:rPr>
                 <w:sz w:val="18"/>
               </w:rPr>
-              <w:t>ещё не получены</w:t>
+              <w:t>160,58</w:t>
+            </w:r>
+          </w:p>
+        </w:tc>
+        <w:tc>
+          <w:tcPr>
+            <w:tcW w:type="dxa" w:w="1233"/>
+          </w:tcPr>
+          <w:p>
+            <w:pPr>
+              <w:spacing w:after="0"/>
+            </w:pPr>
+            <w:r>
+              <w:rPr>
+                <w:sz w:val="18"/>
+              </w:rPr>
+              <w:t>186,92</w:t>
+            </w:r>
+          </w:p>
+        </w:tc>
+        <w:tc>
+          <w:tcPr>
+            <w:tcW w:type="dxa" w:w="1233"/>
+          </w:tcPr>
+          <w:p>
+            <w:pPr>
+              <w:spacing w:after="0"/>
+            </w:pPr>
+            <w:r>
+              <w:rPr>
+                <w:sz w:val="18"/>
+              </w:rPr>
+              <w:t>0/200</w:t>
+            </w:r>
+          </w:p>
+        </w:tc>
+        <w:tc>
+          <w:tcPr>
+            <w:tcW w:type="dxa" w:w="1233"/>
+          </w:tcPr>
+          <w:p>
+            <w:pPr>
+              <w:spacing w:after="0"/>
+            </w:pPr>
+            <w:r>
+              <w:rPr>
+                <w:sz w:val="18"/>
+              </w:rPr>
+              <w:t>0</w:t>
             </w:r>
           </w:p>
         </w:tc>
@@ -718,7 +1534,7 @@
       <w:tr>
         <w:tc>
           <w:tcPr>
-            <w:tcW w:type="dxa" w:w="1973"/>
+            <w:tcW w:type="dxa" w:w="1233"/>
           </w:tcPr>
           <w:p>
             <w:pPr>
@@ -734,7 +1550,7 @@
         </w:tc>
         <w:tc>
           <w:tcPr>
-            <w:tcW w:type="dxa" w:w="1973"/>
+            <w:tcW w:type="dxa" w:w="1233"/>
           </w:tcPr>
           <w:p>
             <w:pPr>
@@ -744,13 +1560,13 @@
               <w:rPr>
                 <w:sz w:val="18"/>
               </w:rPr>
-              <w:t>1/1</w:t>
+              <w:t>8</w:t>
             </w:r>
           </w:p>
         </w:tc>
         <w:tc>
           <w:tcPr>
-            <w:tcW w:type="dxa" w:w="1973"/>
+            <w:tcW w:type="dxa" w:w="1233"/>
           </w:tcPr>
           <w:p>
             <w:pPr>
@@ -760,13 +1576,13 @@
               <w:rPr>
                 <w:sz w:val="18"/>
               </w:rPr>
-              <w:t>keyset/get/batch ANY</w:t>
+              <w:t>list keyset</w:t>
             </w:r>
           </w:p>
         </w:tc>
         <w:tc>
           <w:tcPr>
-            <w:tcW w:type="dxa" w:w="1973"/>
+            <w:tcW w:type="dxa" w:w="1233"/>
           </w:tcPr>
           <w:p>
             <w:pPr>
@@ -776,13 +1592,13 @@
               <w:rPr>
                 <w:sz w:val="18"/>
               </w:rPr>
-              <w:t>те же</w:t>
+              <w:t>2453,80</w:t>
             </w:r>
           </w:p>
         </w:tc>
         <w:tc>
           <w:tcPr>
-            <w:tcW w:type="dxa" w:w="1973"/>
+            <w:tcW w:type="dxa" w:w="1233"/>
           </w:tcPr>
           <w:p>
             <w:pPr>
@@ -792,7 +1608,55 @@
               <w:rPr>
                 <w:sz w:val="18"/>
               </w:rPr>
-              <w:t>ещё не получены</w:t>
+              <w:t>2,51</w:t>
+            </w:r>
+          </w:p>
+        </w:tc>
+        <w:tc>
+          <w:tcPr>
+            <w:tcW w:type="dxa" w:w="1233"/>
+          </w:tcPr>
+          <w:p>
+            <w:pPr>
+              <w:spacing w:after="0"/>
+            </w:pPr>
+            <w:r>
+              <w:rPr>
+                <w:sz w:val="18"/>
+              </w:rPr>
+              <w:t>59,01</w:t>
+            </w:r>
+          </w:p>
+        </w:tc>
+        <w:tc>
+          <w:tcPr>
+            <w:tcW w:type="dxa" w:w="1233"/>
+          </w:tcPr>
+          <w:p>
+            <w:pPr>
+              <w:spacing w:after="0"/>
+            </w:pPr>
+            <w:r>
+              <w:rPr>
+                <w:sz w:val="18"/>
+              </w:rPr>
+              <w:t>0/200</w:t>
+            </w:r>
+          </w:p>
+        </w:tc>
+        <w:tc>
+          <w:tcPr>
+            <w:tcW w:type="dxa" w:w="1233"/>
+          </w:tcPr>
+          <w:p>
+            <w:pPr>
+              <w:spacing w:after="0"/>
+            </w:pPr>
+            <w:r>
+              <w:rPr>
+                <w:sz w:val="18"/>
+              </w:rPr>
+              <w:t>0</w:t>
             </w:r>
           </w:p>
         </w:tc>
@@ -800,7 +1664,137 @@
       <w:tr>
         <w:tc>
           <w:tcPr>
-            <w:tcW w:type="dxa" w:w="1973"/>
+            <w:tcW w:type="dxa" w:w="1233"/>
+          </w:tcPr>
+          <w:p>
+            <w:pPr>
+              <w:spacing w:after="0"/>
+            </w:pPr>
+            <w:r>
+              <w:rPr>
+                <w:sz w:val="18"/>
+              </w:rPr>
+              <w:t>Baseline</w:t>
+            </w:r>
+          </w:p>
+        </w:tc>
+        <w:tc>
+          <w:tcPr>
+            <w:tcW w:type="dxa" w:w="1233"/>
+          </w:tcPr>
+          <w:p>
+            <w:pPr>
+              <w:spacing w:after="0"/>
+            </w:pPr>
+            <w:r>
+              <w:rPr>
+                <w:sz w:val="18"/>
+              </w:rPr>
+              <w:t>1</w:t>
+            </w:r>
+          </w:p>
+        </w:tc>
+        <w:tc>
+          <w:tcPr>
+            <w:tcW w:type="dxa" w:w="1233"/>
+          </w:tcPr>
+          <w:p>
+            <w:pPr>
+              <w:spacing w:after="0"/>
+            </w:pPr>
+            <w:r>
+              <w:rPr>
+                <w:sz w:val="18"/>
+              </w:rPr>
+              <w:t>get</w:t>
+            </w:r>
+          </w:p>
+        </w:tc>
+        <w:tc>
+          <w:tcPr>
+            <w:tcW w:type="dxa" w:w="1233"/>
+          </w:tcPr>
+          <w:p>
+            <w:pPr>
+              <w:spacing w:after="0"/>
+            </w:pPr>
+            <w:r>
+              <w:rPr>
+                <w:sz w:val="18"/>
+              </w:rPr>
+              <w:t>9522,90</w:t>
+            </w:r>
+          </w:p>
+        </w:tc>
+        <w:tc>
+          <w:tcPr>
+            <w:tcW w:type="dxa" w:w="1233"/>
+          </w:tcPr>
+          <w:p>
+            <w:pPr>
+              <w:spacing w:after="0"/>
+            </w:pPr>
+            <w:r>
+              <w:rPr>
+                <w:sz w:val="18"/>
+              </w:rPr>
+              <w:t>2,00</w:t>
+            </w:r>
+          </w:p>
+        </w:tc>
+        <w:tc>
+          <w:tcPr>
+            <w:tcW w:type="dxa" w:w="1233"/>
+          </w:tcPr>
+          <w:p>
+            <w:pPr>
+              <w:spacing w:after="0"/>
+            </w:pPr>
+            <w:r>
+              <w:rPr>
+                <w:sz w:val="18"/>
+              </w:rPr>
+              <w:t>3,50</w:t>
+            </w:r>
+          </w:p>
+        </w:tc>
+        <w:tc>
+          <w:tcPr>
+            <w:tcW w:type="dxa" w:w="1233"/>
+          </w:tcPr>
+          <w:p>
+            <w:pPr>
+              <w:spacing w:after="0"/>
+            </w:pPr>
+            <w:r>
+              <w:rPr>
+                <w:sz w:val="18"/>
+              </w:rPr>
+              <w:t>0/200</w:t>
+            </w:r>
+          </w:p>
+        </w:tc>
+        <w:tc>
+          <w:tcPr>
+            <w:tcW w:type="dxa" w:w="1233"/>
+          </w:tcPr>
+          <w:p>
+            <w:pPr>
+              <w:spacing w:after="0"/>
+            </w:pPr>
+            <w:r>
+              <w:rPr>
+                <w:sz w:val="18"/>
+              </w:rPr>
+              <w:t>198</w:t>
+            </w:r>
+          </w:p>
+        </w:tc>
+      </w:tr>
+      <w:tr>
+        <w:tc>
+          <w:tcPr>
+            <w:tcW w:type="dxa" w:w="1233"/>
           </w:tcPr>
           <w:p>
             <w:pPr>
@@ -816,7 +1810,7 @@
         </w:tc>
         <w:tc>
           <w:tcPr>
-            <w:tcW w:type="dxa" w:w="1973"/>
+            <w:tcW w:type="dxa" w:w="1233"/>
           </w:tcPr>
           <w:p>
             <w:pPr>
@@ -826,13 +1820,13 @@
               <w:rPr>
                 <w:sz w:val="18"/>
               </w:rPr>
-              <w:t>8/8</w:t>
+              <w:t>1</w:t>
             </w:r>
           </w:p>
         </w:tc>
         <w:tc>
           <w:tcPr>
-            <w:tcW w:type="dxa" w:w="1973"/>
+            <w:tcW w:type="dxa" w:w="1233"/>
           </w:tcPr>
           <w:p>
             <w:pPr>
@@ -842,13 +1836,13 @@
               <w:rPr>
                 <w:sz w:val="18"/>
               </w:rPr>
-              <w:t>те же</w:t>
+              <w:t>get</w:t>
             </w:r>
           </w:p>
         </w:tc>
         <w:tc>
           <w:tcPr>
-            <w:tcW w:type="dxa" w:w="1973"/>
+            <w:tcW w:type="dxa" w:w="1233"/>
           </w:tcPr>
           <w:p>
             <w:pPr>
@@ -858,13 +1852,13 @@
               <w:rPr>
                 <w:sz w:val="18"/>
               </w:rPr>
-              <w:t>те же</w:t>
+              <w:t>8333,54</w:t>
             </w:r>
           </w:p>
         </w:tc>
         <w:tc>
           <w:tcPr>
-            <w:tcW w:type="dxa" w:w="1973"/>
+            <w:tcW w:type="dxa" w:w="1233"/>
           </w:tcPr>
           <w:p>
             <w:pPr>
@@ -874,7 +1868,835 @@
               <w:rPr>
                 <w:sz w:val="18"/>
               </w:rPr>
-              <w:t>ещё не получены</w:t>
+              <w:t>2,50</w:t>
+            </w:r>
+          </w:p>
+        </w:tc>
+        <w:tc>
+          <w:tcPr>
+            <w:tcW w:type="dxa" w:w="1233"/>
+          </w:tcPr>
+          <w:p>
+            <w:pPr>
+              <w:spacing w:after="0"/>
+            </w:pPr>
+            <w:r>
+              <w:rPr>
+                <w:sz w:val="18"/>
+              </w:rPr>
+              <w:t>3,50</w:t>
+            </w:r>
+          </w:p>
+        </w:tc>
+        <w:tc>
+          <w:tcPr>
+            <w:tcW w:type="dxa" w:w="1233"/>
+          </w:tcPr>
+          <w:p>
+            <w:pPr>
+              <w:spacing w:after="0"/>
+            </w:pPr>
+            <w:r>
+              <w:rPr>
+                <w:sz w:val="18"/>
+              </w:rPr>
+              <w:t>0/200</w:t>
+            </w:r>
+          </w:p>
+        </w:tc>
+        <w:tc>
+          <w:tcPr>
+            <w:tcW w:type="dxa" w:w="1233"/>
+          </w:tcPr>
+          <w:p>
+            <w:pPr>
+              <w:spacing w:after="0"/>
+            </w:pPr>
+            <w:r>
+              <w:rPr>
+                <w:sz w:val="18"/>
+              </w:rPr>
+              <w:t>199</w:t>
+            </w:r>
+          </w:p>
+        </w:tc>
+      </w:tr>
+      <w:tr>
+        <w:tc>
+          <w:tcPr>
+            <w:tcW w:type="dxa" w:w="1233"/>
+          </w:tcPr>
+          <w:p>
+            <w:pPr>
+              <w:spacing w:after="0"/>
+            </w:pPr>
+            <w:r>
+              <w:rPr>
+                <w:sz w:val="18"/>
+              </w:rPr>
+              <w:t>Baseline</w:t>
+            </w:r>
+          </w:p>
+        </w:tc>
+        <w:tc>
+          <w:tcPr>
+            <w:tcW w:type="dxa" w:w="1233"/>
+          </w:tcPr>
+          <w:p>
+            <w:pPr>
+              <w:spacing w:after="0"/>
+            </w:pPr>
+            <w:r>
+              <w:rPr>
+                <w:sz w:val="18"/>
+              </w:rPr>
+              <w:t>8</w:t>
+            </w:r>
+          </w:p>
+        </w:tc>
+        <w:tc>
+          <w:tcPr>
+            <w:tcW w:type="dxa" w:w="1233"/>
+          </w:tcPr>
+          <w:p>
+            <w:pPr>
+              <w:spacing w:after="0"/>
+            </w:pPr>
+            <w:r>
+              <w:rPr>
+                <w:sz w:val="18"/>
+              </w:rPr>
+              <w:t>get</w:t>
+            </w:r>
+          </w:p>
+        </w:tc>
+        <w:tc>
+          <w:tcPr>
+            <w:tcW w:type="dxa" w:w="1233"/>
+          </w:tcPr>
+          <w:p>
+            <w:pPr>
+              <w:spacing w:after="0"/>
+            </w:pPr>
+            <w:r>
+              <w:rPr>
+                <w:sz w:val="18"/>
+              </w:rPr>
+              <w:t>12498,98</w:t>
+            </w:r>
+          </w:p>
+        </w:tc>
+        <w:tc>
+          <w:tcPr>
+            <w:tcW w:type="dxa" w:w="1233"/>
+          </w:tcPr>
+          <w:p>
+            <w:pPr>
+              <w:spacing w:after="0"/>
+            </w:pPr>
+            <w:r>
+              <w:rPr>
+                <w:sz w:val="18"/>
+              </w:rPr>
+              <w:t>1,50</w:t>
+            </w:r>
+          </w:p>
+        </w:tc>
+        <w:tc>
+          <w:tcPr>
+            <w:tcW w:type="dxa" w:w="1233"/>
+          </w:tcPr>
+          <w:p>
+            <w:pPr>
+              <w:spacing w:after="0"/>
+            </w:pPr>
+            <w:r>
+              <w:rPr>
+                <w:sz w:val="18"/>
+              </w:rPr>
+              <w:t>2,50</w:t>
+            </w:r>
+          </w:p>
+        </w:tc>
+        <w:tc>
+          <w:tcPr>
+            <w:tcW w:type="dxa" w:w="1233"/>
+          </w:tcPr>
+          <w:p>
+            <w:pPr>
+              <w:spacing w:after="0"/>
+            </w:pPr>
+            <w:r>
+              <w:rPr>
+                <w:sz w:val="18"/>
+              </w:rPr>
+              <w:t>0/200</w:t>
+            </w:r>
+          </w:p>
+        </w:tc>
+        <w:tc>
+          <w:tcPr>
+            <w:tcW w:type="dxa" w:w="1233"/>
+          </w:tcPr>
+          <w:p>
+            <w:pPr>
+              <w:spacing w:after="0"/>
+            </w:pPr>
+            <w:r>
+              <w:rPr>
+                <w:sz w:val="18"/>
+              </w:rPr>
+              <w:t>0</w:t>
+            </w:r>
+          </w:p>
+        </w:tc>
+      </w:tr>
+      <w:tr>
+        <w:tc>
+          <w:tcPr>
+            <w:tcW w:type="dxa" w:w="1233"/>
+          </w:tcPr>
+          <w:p>
+            <w:pPr>
+              <w:spacing w:after="0"/>
+            </w:pPr>
+            <w:r>
+              <w:rPr>
+                <w:sz w:val="18"/>
+              </w:rPr>
+              <w:t>Optimized</w:t>
+            </w:r>
+          </w:p>
+        </w:tc>
+        <w:tc>
+          <w:tcPr>
+            <w:tcW w:type="dxa" w:w="1233"/>
+          </w:tcPr>
+          <w:p>
+            <w:pPr>
+              <w:spacing w:after="0"/>
+            </w:pPr>
+            <w:r>
+              <w:rPr>
+                <w:sz w:val="18"/>
+              </w:rPr>
+              <w:t>8</w:t>
+            </w:r>
+          </w:p>
+        </w:tc>
+        <w:tc>
+          <w:tcPr>
+            <w:tcW w:type="dxa" w:w="1233"/>
+          </w:tcPr>
+          <w:p>
+            <w:pPr>
+              <w:spacing w:after="0"/>
+            </w:pPr>
+            <w:r>
+              <w:rPr>
+                <w:sz w:val="18"/>
+              </w:rPr>
+              <w:t>get</w:t>
+            </w:r>
+          </w:p>
+        </w:tc>
+        <w:tc>
+          <w:tcPr>
+            <w:tcW w:type="dxa" w:w="1233"/>
+          </w:tcPr>
+          <w:p>
+            <w:pPr>
+              <w:spacing w:after="0"/>
+            </w:pPr>
+            <w:r>
+              <w:rPr>
+                <w:sz w:val="18"/>
+              </w:rPr>
+              <w:t>11429,03</w:t>
+            </w:r>
+          </w:p>
+        </w:tc>
+        <w:tc>
+          <w:tcPr>
+            <w:tcW w:type="dxa" w:w="1233"/>
+          </w:tcPr>
+          <w:p>
+            <w:pPr>
+              <w:spacing w:after="0"/>
+            </w:pPr>
+            <w:r>
+              <w:rPr>
+                <w:sz w:val="18"/>
+              </w:rPr>
+              <w:t>1,50</w:t>
+            </w:r>
+          </w:p>
+        </w:tc>
+        <w:tc>
+          <w:tcPr>
+            <w:tcW w:type="dxa" w:w="1233"/>
+          </w:tcPr>
+          <w:p>
+            <w:pPr>
+              <w:spacing w:after="0"/>
+            </w:pPr>
+            <w:r>
+              <w:rPr>
+                <w:sz w:val="18"/>
+              </w:rPr>
+              <w:t>2,00</w:t>
+            </w:r>
+          </w:p>
+        </w:tc>
+        <w:tc>
+          <w:tcPr>
+            <w:tcW w:type="dxa" w:w="1233"/>
+          </w:tcPr>
+          <w:p>
+            <w:pPr>
+              <w:spacing w:after="0"/>
+            </w:pPr>
+            <w:r>
+              <w:rPr>
+                <w:sz w:val="18"/>
+              </w:rPr>
+              <w:t>0/200</w:t>
+            </w:r>
+          </w:p>
+        </w:tc>
+        <w:tc>
+          <w:tcPr>
+            <w:tcW w:type="dxa" w:w="1233"/>
+          </w:tcPr>
+          <w:p>
+            <w:pPr>
+              <w:spacing w:after="0"/>
+            </w:pPr>
+            <w:r>
+              <w:rPr>
+                <w:sz w:val="18"/>
+              </w:rPr>
+              <w:t>0</w:t>
+            </w:r>
+          </w:p>
+        </w:tc>
+      </w:tr>
+      <w:tr>
+        <w:tc>
+          <w:tcPr>
+            <w:tcW w:type="dxa" w:w="1233"/>
+          </w:tcPr>
+          <w:p>
+            <w:pPr>
+              <w:spacing w:after="0"/>
+            </w:pPr>
+            <w:r>
+              <w:rPr>
+                <w:sz w:val="18"/>
+              </w:rPr>
+              <w:t>Baseline</w:t>
+            </w:r>
+          </w:p>
+        </w:tc>
+        <w:tc>
+          <w:tcPr>
+            <w:tcW w:type="dxa" w:w="1233"/>
+          </w:tcPr>
+          <w:p>
+            <w:pPr>
+              <w:spacing w:after="0"/>
+            </w:pPr>
+            <w:r>
+              <w:rPr>
+                <w:sz w:val="18"/>
+              </w:rPr>
+              <w:t>1</w:t>
+            </w:r>
+          </w:p>
+        </w:tc>
+        <w:tc>
+          <w:tcPr>
+            <w:tcW w:type="dxa" w:w="1233"/>
+          </w:tcPr>
+          <w:p>
+            <w:pPr>
+              <w:spacing w:after="0"/>
+            </w:pPr>
+            <w:r>
+              <w:rPr>
+                <w:sz w:val="18"/>
+              </w:rPr>
+              <w:t>batch N+1</w:t>
+            </w:r>
+          </w:p>
+        </w:tc>
+        <w:tc>
+          <w:tcPr>
+            <w:tcW w:type="dxa" w:w="1233"/>
+          </w:tcPr>
+          <w:p>
+            <w:pPr>
+              <w:spacing w:after="0"/>
+            </w:pPr>
+            <w:r>
+              <w:rPr>
+                <w:sz w:val="18"/>
+              </w:rPr>
+              <w:t>584,96</w:t>
+            </w:r>
+          </w:p>
+        </w:tc>
+        <w:tc>
+          <w:tcPr>
+            <w:tcW w:type="dxa" w:w="1233"/>
+          </w:tcPr>
+          <w:p>
+            <w:pPr>
+              <w:spacing w:after="0"/>
+            </w:pPr>
+            <w:r>
+              <w:rPr>
+                <w:sz w:val="18"/>
+              </w:rPr>
+              <w:t>18,52</w:t>
+            </w:r>
+          </w:p>
+        </w:tc>
+        <w:tc>
+          <w:tcPr>
+            <w:tcW w:type="dxa" w:w="1233"/>
+          </w:tcPr>
+          <w:p>
+            <w:pPr>
+              <w:spacing w:after="0"/>
+            </w:pPr>
+            <w:r>
+              <w:rPr>
+                <w:sz w:val="18"/>
+              </w:rPr>
+              <w:t>20,00</w:t>
+            </w:r>
+          </w:p>
+        </w:tc>
+        <w:tc>
+          <w:tcPr>
+            <w:tcW w:type="dxa" w:w="1233"/>
+          </w:tcPr>
+          <w:p>
+            <w:pPr>
+              <w:spacing w:after="0"/>
+            </w:pPr>
+            <w:r>
+              <w:rPr>
+                <w:sz w:val="18"/>
+              </w:rPr>
+              <w:t>0/200</w:t>
+            </w:r>
+          </w:p>
+        </w:tc>
+        <w:tc>
+          <w:tcPr>
+            <w:tcW w:type="dxa" w:w="1233"/>
+          </w:tcPr>
+          <w:p>
+            <w:pPr>
+              <w:spacing w:after="0"/>
+            </w:pPr>
+            <w:r>
+              <w:rPr>
+                <w:sz w:val="18"/>
+              </w:rPr>
+              <w:t>3999</w:t>
+            </w:r>
+          </w:p>
+        </w:tc>
+      </w:tr>
+      <w:tr>
+        <w:tc>
+          <w:tcPr>
+            <w:tcW w:type="dxa" w:w="1233"/>
+          </w:tcPr>
+          <w:p>
+            <w:pPr>
+              <w:spacing w:after="0"/>
+            </w:pPr>
+            <w:r>
+              <w:rPr>
+                <w:sz w:val="18"/>
+              </w:rPr>
+              <w:t>Optimized</w:t>
+            </w:r>
+          </w:p>
+        </w:tc>
+        <w:tc>
+          <w:tcPr>
+            <w:tcW w:type="dxa" w:w="1233"/>
+          </w:tcPr>
+          <w:p>
+            <w:pPr>
+              <w:spacing w:after="0"/>
+            </w:pPr>
+            <w:r>
+              <w:rPr>
+                <w:sz w:val="18"/>
+              </w:rPr>
+              <w:t>1</w:t>
+            </w:r>
+          </w:p>
+        </w:tc>
+        <w:tc>
+          <w:tcPr>
+            <w:tcW w:type="dxa" w:w="1233"/>
+          </w:tcPr>
+          <w:p>
+            <w:pPr>
+              <w:spacing w:after="0"/>
+            </w:pPr>
+            <w:r>
+              <w:rPr>
+                <w:sz w:val="18"/>
+              </w:rPr>
+              <w:t>batch ANY</w:t>
+            </w:r>
+          </w:p>
+        </w:tc>
+        <w:tc>
+          <w:tcPr>
+            <w:tcW w:type="dxa" w:w="1233"/>
+          </w:tcPr>
+          <w:p>
+            <w:pPr>
+              <w:spacing w:after="0"/>
+            </w:pPr>
+            <w:r>
+              <w:rPr>
+                <w:sz w:val="18"/>
+              </w:rPr>
+              <w:t>5882,15</w:t>
+            </w:r>
+          </w:p>
+        </w:tc>
+        <w:tc>
+          <w:tcPr>
+            <w:tcW w:type="dxa" w:w="1233"/>
+          </w:tcPr>
+          <w:p>
+            <w:pPr>
+              <w:spacing w:after="0"/>
+            </w:pPr>
+            <w:r>
+              <w:rPr>
+                <w:sz w:val="18"/>
+              </w:rPr>
+              <w:t>3,00</w:t>
+            </w:r>
+          </w:p>
+        </w:tc>
+        <w:tc>
+          <w:tcPr>
+            <w:tcW w:type="dxa" w:w="1233"/>
+          </w:tcPr>
+          <w:p>
+            <w:pPr>
+              <w:spacing w:after="0"/>
+            </w:pPr>
+            <w:r>
+              <w:rPr>
+                <w:sz w:val="18"/>
+              </w:rPr>
+              <w:t>4,00</w:t>
+            </w:r>
+          </w:p>
+        </w:tc>
+        <w:tc>
+          <w:tcPr>
+            <w:tcW w:type="dxa" w:w="1233"/>
+          </w:tcPr>
+          <w:p>
+            <w:pPr>
+              <w:spacing w:after="0"/>
+            </w:pPr>
+            <w:r>
+              <w:rPr>
+                <w:sz w:val="18"/>
+              </w:rPr>
+              <w:t>0/200</w:t>
+            </w:r>
+          </w:p>
+        </w:tc>
+        <w:tc>
+          <w:tcPr>
+            <w:tcW w:type="dxa" w:w="1233"/>
+          </w:tcPr>
+          <w:p>
+            <w:pPr>
+              <w:spacing w:after="0"/>
+            </w:pPr>
+            <w:r>
+              <w:rPr>
+                <w:sz w:val="18"/>
+              </w:rPr>
+              <w:t>197</w:t>
+            </w:r>
+          </w:p>
+        </w:tc>
+      </w:tr>
+      <w:tr>
+        <w:tc>
+          <w:tcPr>
+            <w:tcW w:type="dxa" w:w="1233"/>
+          </w:tcPr>
+          <w:p>
+            <w:pPr>
+              <w:spacing w:after="0"/>
+            </w:pPr>
+            <w:r>
+              <w:rPr>
+                <w:sz w:val="18"/>
+              </w:rPr>
+              <w:t>Baseline</w:t>
+            </w:r>
+          </w:p>
+        </w:tc>
+        <w:tc>
+          <w:tcPr>
+            <w:tcW w:type="dxa" w:w="1233"/>
+          </w:tcPr>
+          <w:p>
+            <w:pPr>
+              <w:spacing w:after="0"/>
+            </w:pPr>
+            <w:r>
+              <w:rPr>
+                <w:sz w:val="18"/>
+              </w:rPr>
+              <w:t>8</w:t>
+            </w:r>
+          </w:p>
+        </w:tc>
+        <w:tc>
+          <w:tcPr>
+            <w:tcW w:type="dxa" w:w="1233"/>
+          </w:tcPr>
+          <w:p>
+            <w:pPr>
+              <w:spacing w:after="0"/>
+            </w:pPr>
+            <w:r>
+              <w:rPr>
+                <w:sz w:val="18"/>
+              </w:rPr>
+              <w:t>batch N+1</w:t>
+            </w:r>
+          </w:p>
+        </w:tc>
+        <w:tc>
+          <w:tcPr>
+            <w:tcW w:type="dxa" w:w="1233"/>
+          </w:tcPr>
+          <w:p>
+            <w:pPr>
+              <w:spacing w:after="0"/>
+            </w:pPr>
+            <w:r>
+              <w:rPr>
+                <w:sz w:val="18"/>
+              </w:rPr>
+              <w:t>2349,59</w:t>
+            </w:r>
+          </w:p>
+        </w:tc>
+        <w:tc>
+          <w:tcPr>
+            <w:tcW w:type="dxa" w:w="1233"/>
+          </w:tcPr>
+          <w:p>
+            <w:pPr>
+              <w:spacing w:after="0"/>
+            </w:pPr>
+            <w:r>
+              <w:rPr>
+                <w:sz w:val="18"/>
+              </w:rPr>
+              <w:t>4,50</w:t>
+            </w:r>
+          </w:p>
+        </w:tc>
+        <w:tc>
+          <w:tcPr>
+            <w:tcW w:type="dxa" w:w="1233"/>
+          </w:tcPr>
+          <w:p>
+            <w:pPr>
+              <w:spacing w:after="0"/>
+            </w:pPr>
+            <w:r>
+              <w:rPr>
+                <w:sz w:val="18"/>
+              </w:rPr>
+              <w:t>4,50</w:t>
+            </w:r>
+          </w:p>
+        </w:tc>
+        <w:tc>
+          <w:tcPr>
+            <w:tcW w:type="dxa" w:w="1233"/>
+          </w:tcPr>
+          <w:p>
+            <w:pPr>
+              <w:spacing w:after="0"/>
+            </w:pPr>
+            <w:r>
+              <w:rPr>
+                <w:sz w:val="18"/>
+              </w:rPr>
+              <w:t>0/200</w:t>
+            </w:r>
+          </w:p>
+        </w:tc>
+        <w:tc>
+          <w:tcPr>
+            <w:tcW w:type="dxa" w:w="1233"/>
+          </w:tcPr>
+          <w:p>
+            <w:pPr>
+              <w:spacing w:after="0"/>
+            </w:pPr>
+            <w:r>
+              <w:rPr>
+                <w:sz w:val="18"/>
+              </w:rPr>
+              <w:t>0</w:t>
+            </w:r>
+          </w:p>
+        </w:tc>
+      </w:tr>
+      <w:tr>
+        <w:tc>
+          <w:tcPr>
+            <w:tcW w:type="dxa" w:w="1233"/>
+          </w:tcPr>
+          <w:p>
+            <w:pPr>
+              <w:spacing w:after="0"/>
+            </w:pPr>
+            <w:r>
+              <w:rPr>
+                <w:sz w:val="18"/>
+              </w:rPr>
+              <w:t>Optimized</w:t>
+            </w:r>
+          </w:p>
+        </w:tc>
+        <w:tc>
+          <w:tcPr>
+            <w:tcW w:type="dxa" w:w="1233"/>
+          </w:tcPr>
+          <w:p>
+            <w:pPr>
+              <w:spacing w:after="0"/>
+            </w:pPr>
+            <w:r>
+              <w:rPr>
+                <w:sz w:val="18"/>
+              </w:rPr>
+              <w:t>8</w:t>
+            </w:r>
+          </w:p>
+        </w:tc>
+        <w:tc>
+          <w:tcPr>
+            <w:tcW w:type="dxa" w:w="1233"/>
+          </w:tcPr>
+          <w:p>
+            <w:pPr>
+              <w:spacing w:after="0"/>
+            </w:pPr>
+            <w:r>
+              <w:rPr>
+                <w:sz w:val="18"/>
+              </w:rPr>
+              <w:t>batch ANY</w:t>
+            </w:r>
+          </w:p>
+        </w:tc>
+        <w:tc>
+          <w:tcPr>
+            <w:tcW w:type="dxa" w:w="1233"/>
+          </w:tcPr>
+          <w:p>
+            <w:pPr>
+              <w:spacing w:after="0"/>
+            </w:pPr>
+            <w:r>
+              <w:rPr>
+                <w:sz w:val="18"/>
+              </w:rPr>
+              <w:t>7273,15</w:t>
+            </w:r>
+          </w:p>
+        </w:tc>
+        <w:tc>
+          <w:tcPr>
+            <w:tcW w:type="dxa" w:w="1233"/>
+          </w:tcPr>
+          <w:p>
+            <w:pPr>
+              <w:spacing w:after="0"/>
+            </w:pPr>
+            <w:r>
+              <w:rPr>
+                <w:sz w:val="18"/>
+              </w:rPr>
+              <w:t>2,00</w:t>
+            </w:r>
+          </w:p>
+        </w:tc>
+        <w:tc>
+          <w:tcPr>
+            <w:tcW w:type="dxa" w:w="1233"/>
+          </w:tcPr>
+          <w:p>
+            <w:pPr>
+              <w:spacing w:after="0"/>
+            </w:pPr>
+            <w:r>
+              <w:rPr>
+                <w:sz w:val="18"/>
+              </w:rPr>
+              <w:t>2,50</w:t>
+            </w:r>
+          </w:p>
+        </w:tc>
+        <w:tc>
+          <w:tcPr>
+            <w:tcW w:type="dxa" w:w="1233"/>
+          </w:tcPr>
+          <w:p>
+            <w:pPr>
+              <w:spacing w:after="0"/>
+            </w:pPr>
+            <w:r>
+              <w:rPr>
+                <w:sz w:val="18"/>
+              </w:rPr>
+              <w:t>0/200</w:t>
+            </w:r>
+          </w:p>
+        </w:tc>
+        <w:tc>
+          <w:tcPr>
+            <w:tcW w:type="dxa" w:w="1233"/>
+          </w:tcPr>
+          <w:p>
+            <w:pPr>
+              <w:spacing w:after="0"/>
+            </w:pPr>
+            <w:r>
+              <w:rPr>
+                <w:sz w:val="18"/>
+              </w:rPr>
+              <w:t>0</w:t>
             </w:r>
           </w:p>
         </w:tc>
@@ -888,7 +2710,7 @@
     <w:p>
       <w:pPr/>
       <w:r>
-        <w:t>Каждый сценарий предусматривает 10 последовательных warmup-запросов и 200 измеряемых closed-loop запросов без пауз. Список должен возвращать одинаковые ID на логической глубине 80000; get — ID 1; batch — ID 1..20 в одинаковом порядке. Будут сохранены elapsed/RPS/p95/p99/errors/error_rate и ожидание пула. Итоговые таблицы до/после с цифрами будут заполнены только после успешного прогона. При слабом или шумном улучшении вывод будет отражать измерения.</w:t>
+        <w:t>При pool=8 keyset дал около 28,4× RPS относительно глубокого OFFSET, а batch ANY — около 3,1× относительно N+1. Обычный get ускорения не показал: это контрольный маршрут с одним prepared SELECT в обоих вариантах. При pool=1 baseline list суммарное ожидание соединения составило 109101 мс по всем запросам, при pool=8 — ноль; это суммарное время ожидания, а не длительность эксперимента. Однако optimized list при pool=8 имел меньший RPS, чем при pool=1, и p99 59,01 мс: короткий тест на одной машине шумен, поэтому нельзя объявить pool=8 лучшим для всех операций. Отдельные SQL-планы и HTTP-нагрузка измеряют разные уровни системы.</w:t>
       </w:r>
     </w:p>
     <w:p>
@@ -896,7 +2718,7 @@
         <w:pStyle w:val="Heading1"/>
       </w:pPr>
       <w:r>
-        <w:t>Следующее необходимое действие</w:t>
+        <w:t>Снимки выполнения</w:t>
       </w:r>
     </w:p>
     <w:p>
@@ -904,32 +2726,129 @@
         <w:keepNext/>
       </w:pPr>
       <w:r>
-        <w:t>Из любого каталога своего PowerShell запустите:</w:t>
+        <w:t>Пароль на снимке скрыт; видны версии, подготовленные схемы и начало EXPLAIN:</w:t>
       </w:r>
     </w:p>
     <w:p>
       <w:pPr>
-        <w:pStyle w:val="Code"/>
-        <w:keepNext w:val="0"/>
+        <w:spacing w:before="100" w:after="60"/>
+        <w:jc w:val="center"/>
       </w:pPr>
       <w:r>
-        <w:t>&amp; 'D:\MAG\GO\practic\practices\pz14-notes-db\run-local.ps1'</w:t>
+        <w:drawing>
+          <wp:inline xmlns:a="http://schemas.openxmlformats.org/drawingml/2006/main" xmlns:pic="http://schemas.openxmlformats.org/drawingml/2006/picture">
+            <wp:extent cx="5220000" cy="3040220"/>
+            <wp:docPr id="1" name="Picture 1"/>
+            <wp:cNvGraphicFramePr>
+              <a:graphicFrameLocks noChangeAspect="1"/>
+            </wp:cNvGraphicFramePr>
+            <a:graphic>
+              <a:graphicData uri="http://schemas.openxmlformats.org/drawingml/2006/picture">
+                <pic:pic>
+                  <pic:nvPicPr>
+                    <pic:cNvPr id="0" name="start.png"/>
+                    <pic:cNvPicPr/>
+                  </pic:nvPicPr>
+                  <pic:blipFill>
+                    <a:blip r:embed="rId20"/>
+                    <a:stretch>
+                      <a:fillRect/>
+                    </a:stretch>
+                  </pic:blipFill>
+                  <pic:spPr>
+                    <a:xfrm>
+                      <a:off x="0" y="0"/>
+                      <a:ext cx="5220000" cy="3040220"/>
+                    </a:xfrm>
+                    <a:prstGeom prst="rect"/>
+                  </pic:spPr>
+                </pic:pic>
+              </a:graphicData>
+            </a:graphic>
+          </wp:inline>
+        </w:drawing>
       </w:r>
     </w:p>
     <w:p>
-      <w:pPr/>
+      <w:pPr>
+        <w:spacing w:after="160"/>
+        <w:jc w:val="center"/>
+      </w:pPr>
       <w:r>
-        <w:t xml:space="preserve">Скрипт запросит пароль PostgreSQL скрытым вводом. Он не пишет пароль, DSN или аргументы с секретами в логи. По завершении напечатает путь вида </w:t>
+        <w:rPr>
+          <w:sz w:val="17"/>
+        </w:rPr>
+        <w:t>Запуск практики 14 и исходный план</w:t>
+      </w:r>
+    </w:p>
+    <w:p>
+      <w:pPr>
+        <w:keepNext/>
+      </w:pPr>
+      <w:r>
+        <w:t xml:space="preserve">После планов и нагрузки скрипт завершился строкой </w:t>
       </w:r>
       <w:r>
         <w:rPr>
           <w:rFonts w:ascii="Consolas" w:hAnsi="Consolas"/>
           <w:sz w:val="18"/>
         </w:rPr>
-        <w:t>D:\MAG\GO\.local\pz14-results\&lt;UUID&gt;</w:t>
+        <w:t>PZ14 scenario passed.</w:t>
       </w:r>
       <w:r>
-        <w:t>. Нужен этот каталог логов, чтобы проверить результаты и обновить Markdown и Word; пароль не нужен. Если возникнет ошибка, собственные процессы и временные файлы очищаются в finally; причина будет рассмотрена до признания практики завершённой.</w:t>
+        <w:t>; старые данные и глобальная конфигурация PostgreSQL не менялись:</w:t>
+      </w:r>
+    </w:p>
+    <w:p>
+      <w:pPr>
+        <w:spacing w:before="100" w:after="60"/>
+        <w:jc w:val="center"/>
+      </w:pPr>
+      <w:r>
+        <w:drawing>
+          <wp:inline xmlns:a="http://schemas.openxmlformats.org/drawingml/2006/main" xmlns:pic="http://schemas.openxmlformats.org/drawingml/2006/picture">
+            <wp:extent cx="5220000" cy="2346786"/>
+            <wp:docPr id="2" name="Picture 2"/>
+            <wp:cNvGraphicFramePr>
+              <a:graphicFrameLocks noChangeAspect="1"/>
+            </wp:cNvGraphicFramePr>
+            <a:graphic>
+              <a:graphicData uri="http://schemas.openxmlformats.org/drawingml/2006/picture">
+                <pic:pic>
+                  <pic:nvPicPr>
+                    <pic:cNvPr id="0" name="complete.png"/>
+                    <pic:cNvPicPr/>
+                  </pic:nvPicPr>
+                  <pic:blipFill>
+                    <a:blip r:embed="rId21"/>
+                    <a:stretch>
+                      <a:fillRect/>
+                    </a:stretch>
+                  </pic:blipFill>
+                  <pic:spPr>
+                    <a:xfrm>
+                      <a:off x="0" y="0"/>
+                      <a:ext cx="5220000" cy="2346786"/>
+                    </a:xfrm>
+                    <a:prstGeom prst="rect"/>
+                  </pic:spPr>
+                </pic:pic>
+              </a:graphicData>
+            </a:graphic>
+          </wp:inline>
+        </w:drawing>
+      </w:r>
+    </w:p>
+    <w:p>
+      <w:pPr>
+        <w:spacing w:after="160"/>
+        <w:jc w:val="center"/>
+      </w:pPr>
+      <w:r>
+        <w:rPr>
+          <w:sz w:val="17"/>
+        </w:rPr>
+        <w:t>Завершение сценария практики 14</w:t>
       </w:r>
     </w:p>
     <w:p>
@@ -988,7 +2907,7 @@
         <w:t>Какие параметры пула настраиваются и почему?</w:t>
       </w:r>
       <w:r>
-        <w:t xml:space="preserve"> MaxOpenConns ограничивает параллельные подключения, MaxIdleConns задаёт запас для повторного использования, ConnMaxLifetime и ConnMaxIdleTime ограничивают возраст/простой. Здесь сравниваются 1 и 8 при восьми клиентах; жизненный цикл 30 и 5 минут. Фактические очереди и задержки ещё не измерены.</w:t>
+        <w:t xml:space="preserve"> MaxOpenConns ограничивает параллельные подключения, MaxIdleConns задаёт запас для повторного использования, ConnMaxLifetime и ConnMaxIdleTime ограничивают возраст/простой. Здесь сравнивались 1 и 8 при восьми клиентах; жизненный цикл 30 и 5 минут. При pool=1 были очереди, при pool=8 — нет, но на быстром list больший пул не дал лучшего RPS.</w:t>
       </w:r>
     </w:p>
     <w:p>
@@ -1005,7 +2924,7 @@
         <w:t>Что показывает EXPLAIN (ANALYZE, BUFFERS)?</w:t>
       </w:r>
       <w:r>
-        <w:t xml:space="preserve"> План, реальные строки/циклы/времена выполнения и обращения к буферам. Seq Scan читает таблицу последовательно, Index Scan использует индекс и при необходимости heap; Bitmap Scan может сочетать индекс с пакетным чтением страниц. ANALYZE действительно исполняет запрос, поэтому с изменяющими запросами нужна осторожность. Планы этой практики пока не получены.</w:t>
+        <w:t xml:space="preserve"> План, реальные строки/циклы/времена выполнения и обращения к буферам. Seq Scan читает таблицу последовательно, Index Scan использует индекс и при необходимости heap; Bitmap Scan может сочетать индекс с пакетным чтением страниц. ANALYZE действительно исполняет запрос, поэтому с изменяющими запросами нужна осторожность. Здесь baseline OFFSET использовал Seq Scan и сортировку, optimized keyset — Index Scan.</w:t>
       </w:r>
     </w:p>
     <w:p>
@@ -1056,7 +2975,7 @@
         <w:t>Как выбрать размер пула?</w:t>
       </w:r>
       <w:r>
-        <w:t xml:space="preserve"> Ограничить общую сумму соединений экземпляров сервиса доступной мощностью и лимитом PostgreSQL, провести одинаковую нагрузку для нескольких значений, смотреть RPS, p95/p99, ошибки, WaitCount/WaitDuration, InUse/Idle и нагрузку БД. Большой пул может ухудшить конкуренцию и расход памяти. До замеров выбирать 8 как доказанно лучший нельзя.</w:t>
+        <w:t xml:space="preserve"> Ограничить общую сумму соединений экземпляров сервиса доступной мощностью и лимитом PostgreSQL, провести одинаковую нагрузку для нескольких значений, смотреть RPS, p95/p99, ошибки, WaitCount/WaitDuration, InUse/Idle и нагрузку БД. Большой пул может ухудшить конкуренцию и расход памяти. В этом прогоне pool=8 устранил ожидания, но для optimized list дал меньший RPS; нужен повторный и более длительный эксперимент перед производственным выбором.</w:t>
       </w:r>
     </w:p>
     <w:p>
@@ -1064,15 +2983,25 @@
         <w:pStyle w:val="Heading1"/>
       </w:pPr>
       <w:r>
-        <w:t>Вывод и оставшиеся пункты</w:t>
+        <w:t>Вывод</w:t>
       </w:r>
     </w:p>
     <w:p>
       <w:pPr/>
       <w:r>
-        <w:t xml:space="preserve">Подготовка завершена; реальный прогон заблокирован паролем. Проверки БД, EXPLAIN и нагрузочные метрики остаются неподтверждёнными. Бонусы Redis и read/write split не выполнялись. </w:t>
+        <w:t xml:space="preserve">Обязательная часть выполнена: PostgreSQL Notes API, два изолированных набора по 100000 строк, реальные EXPLAIN до/после, keyset и батчинг с проверкой результата, подготовленные запросы, транзакция с commit/rollback и нагрузка при двух размерах пула. На этой выборке глубокий OFFSET и N+1 оказались главными узкими местами; индексы и батчинг их устранили. Дальше стоит повторить нагрузку дольше и на нескольких машинах, затем подобрать размер пула под ограничения PostgreSQL. </w:t>
       </w:r>
-      <w:hyperlink r:id="rId10">
+      <w:r>
+        <w:rPr>
+          <w:rFonts w:ascii="Consolas" w:hAnsi="Consolas"/>
+          <w:sz w:val="18"/>
+        </w:rPr>
+        <w:t>pg_stat_statements</w:t>
+      </w:r>
+      <w:r>
+        <w:t xml:space="preserve"> осталось недоступно без изменения глобального preload; бонусы Redis и read/write split не выполнялись. </w:t>
+      </w:r>
+      <w:hyperlink r:id="rId22">
         <w:r>
           <w:rPr>
             <w:color w:val="195A85"/>
@@ -1458,13 +3387,13 @@
     <w:qFormat/>
     <w:rsid w:val="00FC693F"/>
     <w:pPr>
-      <w:spacing w:after="120" w:line="269" w:lineRule="auto"/>
+      <w:spacing w:after="80" w:line="252" w:lineRule="auto"/>
     </w:pPr>
     <w:rPr>
       <w:rFonts w:ascii="Calibri" w:hAnsi="Calibri" w:eastAsia="Calibri" w:cs="Calibri"/>
       <w:b w:val="0"/>
       <w:color w:val="000000"/>
-      <w:sz w:val="21"/>
+      <w:sz w:val="20"/>
     </w:rPr>
   </w:style>
   <w:style w:type="paragraph" w:styleId="Header">

</xml_diff>